<commit_message>
Add technical SEO foundation and admin SEO fields.
Ship robots/sitemap, canonical/OG/JSON-LD, admin noindex, seo_* on products/categories, and cutover stubs; sync docs with the SEO roadmap.

Co-authored-by: Cursor <cursoragent@cursor.com>
</commit_message>
<xml_diff>
--- a/docs/Политика обработки ПД.docx
+++ b/docs/Политика обработки ПД.docx
@@ -99,6 +99,49 @@
           <w:rFonts w:ascii="Arial" w:eastAsia="Times New Roman" w:hAnsi="Arial" w:cs="Arial"/>
           <w:color w:val="212529"/>
           <w:sz w:val="13"/>
+        </w:rPr>
+        <w:t xml:space="preserve"> (</w:t>
+      </w:r>
+      <w:r>
+        <w:rPr>
+          <w:rFonts w:ascii="Manrope" w:eastAsia="Times New Roman" w:hAnsi="Manrope" w:cs="Times New Roman"/>
+          <w:color w:val="2D2D2D"/>
+          <w:sz w:val="13"/>
+          <w:szCs w:val="13"/>
+        </w:rPr>
+        <w:t xml:space="preserve">ИНН </w:t>
+      </w:r>
+      <w:r>
+        <w:rPr>
+          <w:rFonts w:ascii="Manrope" w:eastAsia="Times New Roman" w:hAnsi="Manrope" w:cs="Times New Roman"/>
+          <w:color w:val="2D2D2D"/>
+          <w:sz w:val="13"/>
+          <w:szCs w:val="13"/>
+        </w:rPr>
+        <w:t>7716531100</w:t>
+      </w:r>
+      <w:r>
+        <w:rPr>
+          <w:rFonts w:ascii="Manrope" w:eastAsia="Times New Roman" w:hAnsi="Manrope" w:cs="Times New Roman"/>
+          <w:color w:val="2D2D2D"/>
+          <w:sz w:val="13"/>
+          <w:szCs w:val="13"/>
+        </w:rPr>
+        <w:t>, ОГРН 1057747879342</w:t>
+      </w:r>
+      <w:r>
+        <w:rPr>
+          <w:rFonts w:ascii="Arial" w:eastAsia="Times New Roman" w:hAnsi="Arial" w:cs="Arial"/>
+          <w:color w:val="212529"/>
+          <w:sz w:val="13"/>
+        </w:rPr>
+        <w:t>)</w:t>
+      </w:r>
+      <w:r>
+        <w:rPr>
+          <w:rFonts w:ascii="Arial" w:eastAsia="Times New Roman" w:hAnsi="Arial" w:cs="Arial"/>
+          <w:color w:val="212529"/>
+          <w:sz w:val="13"/>
           <w:szCs w:val="13"/>
         </w:rPr>
         <w:t> (далее — Оператор).</w:t>
@@ -1203,19 +1246,8 @@
           <w:sz w:val="13"/>
           <w:szCs w:val="13"/>
         </w:rPr>
-        <w:t xml:space="preserve">— получать информацию, касающуюся обработки его персональных данных, за исключением случаев, предусмотренных федеральными законами. Сведения предоставляются субъекту персональных данных Оператором в доступной форме, и в них не должны содержаться персональные данные, относящиеся к другим субъектам персональных данных, за исключением случаев, когда имеются законные основания для раскрытия таких персональных данных. </w:t>
-      </w:r>
-      <w:proofErr w:type="gramStart"/>
-      <w:r>
-        <w:rPr>
-          <w:rFonts w:ascii="Arial" w:eastAsia="Times New Roman" w:hAnsi="Arial" w:cs="Arial"/>
-          <w:color w:val="212529"/>
-          <w:sz w:val="13"/>
-          <w:szCs w:val="13"/>
-        </w:rPr>
-        <w:t>Перечень информации и порядок ее получения установлен Законом о персональных данных;</w:t>
-      </w:r>
-      <w:proofErr w:type="gramEnd"/>
+        <w:t>— получать информацию, касающуюся обработки его персональных данных, за исключением случаев, предусмотренных федеральными законами. Сведения предоставляются субъекту персональных данных Оператором в доступной форме, и в них не должны содержаться персональные данные, относящиеся к другим субъектам персональных данных, за исключением случаев, когда имеются законные основания для раскрытия таких персональных данных. Перечень информации и порядок ее получения установлен Законом о персональных данных;</w:t>
+      </w:r>
     </w:p>
     <w:p>
       <w:pPr>
@@ -3636,6 +3668,7 @@
   <w:style w:type="paragraph" w:default="1" w:styleId="a">
     <w:name w:val="Normal"/>
     <w:qFormat/>
+    <w:rsid w:val="005C2E27"/>
   </w:style>
   <w:style w:type="paragraph" w:styleId="4">
     <w:name w:val="heading 4"/>

</xml_diff>